<commit_message>
feat: boton de logout en vista admin + recibo de luz mas legible
- Agrega boton "Salir" en el Header del panel admin (antes solo el
  inquilino tenia logout)
- Rebalancea el espaciado de la plantilla de recibo de luz: fuentes y
  padding mas comodos para que el contenido respire, sin pasar de 1 pagina

Co-Authored-By: Claude Opus 4.7 (1M context) <noreply@anthropic.com>
</commit_message>
<xml_diff>
--- a/membrete-referencia/recibo-luz-template.docx
+++ b/membrete-referencia/recibo-luz-template.docx
@@ -83,15 +83,15 @@
     <w:p/>
     <w:p>
       <w:pPr>
-        <w:spacing w:before="0" w:after="20" w:line="240" w:lineRule="auto"/>
+        <w:spacing w:before="0" w:after="40" w:line="240" w:lineRule="auto"/>
         <w:jc w:val="center"/>
       </w:pPr>
       <w:r>
         <w:rPr>
           <w:rFonts w:ascii="Arial" w:hAnsi="Arial" w:cs="Arial"/>
           <w:b/>
-          <w:sz w:val="28"/>
-          <w:szCs w:val="28"/>
+          <w:sz w:val="34"/>
+          <w:szCs w:val="34"/>
           <w:color w:val="333333"/>
           <w:spacing w:val="60"/>
         </w:rPr>
@@ -100,14 +100,14 @@
     </w:p>
     <w:p>
       <w:pPr>
-        <w:spacing w:before="0" w:after="120" w:line="240" w:lineRule="auto"/>
+        <w:spacing w:before="0" w:after="160" w:line="240" w:lineRule="auto"/>
         <w:jc w:val="center"/>
       </w:pPr>
       <w:r>
         <w:rPr>
           <w:rFonts w:ascii="Arial" w:hAnsi="Arial" w:cs="Arial"/>
-          <w:sz w:val="16"/>
-          <w:szCs w:val="16"/>
+          <w:sz w:val="18"/>
+          <w:szCs w:val="18"/>
           <w:color w:val="555555"/>
           <w:spacing w:val="30"/>
         </w:rPr>
@@ -127,10 +127,10 @@
           <w:insideV w:val="single" w:sz="4" w:color="CCCCCC"/>
         </w:tblBorders>
         <w:tblCellMar>
-          <w:top w:w="20" w:type="dxa"/>
-          <w:left w:w="80" w:type="dxa"/>
-          <w:bottom w:w="20" w:type="dxa"/>
-          <w:right w:w="80" w:type="dxa"/>
+          <w:top w:w="60" w:type="dxa"/>
+          <w:left w:w="90" w:type="dxa"/>
+          <w:bottom w:w="60" w:type="dxa"/>
+          <w:right w:w="90" w:type="dxa"/>
         </w:tblCellMar>
       </w:tblPr>
       <w:tblGrid>
@@ -155,39 +155,39 @@
           </w:tcPr>
           <w:p>
             <w:pPr>
-              <w:spacing w:before="0" w:after="0" w:line="220" w:lineRule="auto"/>
-            </w:pPr>
-            <w:r>
-              <w:rPr>
-                <w:rFonts w:ascii="Arial" w:hAnsi="Arial" w:cs="Arial"/>
-                <w:sz w:val="18"/>
-                <w:szCs w:val="18"/>
-                <w:color w:val="555555"/>
-              </w:rPr>
-              <w:t xml:space="preserve">Recibo N°</w:t>
-            </w:r>
-          </w:p>
-        </w:tc>
-        <w:tc>
-          <w:tcPr>
-            <w:tcW w:w="5500" w:type="dxa"/>
-            <w:tcBorders>
-              <w:top w:val="single" w:sz="4" w:color="CCCCCC"/>
-              <w:left w:val="single" w:sz="4" w:color="CCCCCC"/>
-              <w:bottom w:val="single" w:sz="4" w:color="CCCCCC"/>
-              <w:right w:val="single" w:sz="4" w:color="CCCCCC"/>
-            </w:tcBorders>
-            <w:vAlign w:val="center"/>
-          </w:tcPr>
-          <w:p>
-            <w:pPr>
-              <w:spacing w:before="0" w:after="0" w:line="220" w:lineRule="auto"/>
+              <w:spacing w:before="0" w:after="0" w:line="240" w:lineRule="auto"/>
             </w:pPr>
             <w:r>
               <w:rPr>
                 <w:rFonts w:ascii="Arial" w:hAnsi="Arial" w:cs="Arial"/>
                 <w:sz w:val="20"/>
                 <w:szCs w:val="20"/>
+                <w:color w:val="555555"/>
+              </w:rPr>
+              <w:t xml:space="preserve">Recibo N°</w:t>
+            </w:r>
+          </w:p>
+        </w:tc>
+        <w:tc>
+          <w:tcPr>
+            <w:tcW w:w="5500" w:type="dxa"/>
+            <w:tcBorders>
+              <w:top w:val="single" w:sz="4" w:color="CCCCCC"/>
+              <w:left w:val="single" w:sz="4" w:color="CCCCCC"/>
+              <w:bottom w:val="single" w:sz="4" w:color="CCCCCC"/>
+              <w:right w:val="single" w:sz="4" w:color="CCCCCC"/>
+            </w:tcBorders>
+            <w:vAlign w:val="center"/>
+          </w:tcPr>
+          <w:p>
+            <w:pPr>
+              <w:spacing w:before="0" w:after="0" w:line="240" w:lineRule="auto"/>
+            </w:pPr>
+            <w:r>
+              <w:rPr>
+                <w:rFonts w:ascii="Arial" w:hAnsi="Arial" w:cs="Arial"/>
+                <w:sz w:val="22"/>
+                <w:szCs w:val="22"/>
                 <w:color w:val="333333"/>
               </w:rPr>
               <w:t xml:space="preserve">{reciboNum}</w:t>
@@ -213,39 +213,39 @@
           </w:tcPr>
           <w:p>
             <w:pPr>
-              <w:spacing w:before="0" w:after="0" w:line="220" w:lineRule="auto"/>
-            </w:pPr>
-            <w:r>
-              <w:rPr>
-                <w:rFonts w:ascii="Arial" w:hAnsi="Arial" w:cs="Arial"/>
-                <w:sz w:val="18"/>
-                <w:szCs w:val="18"/>
-                <w:color w:val="555555"/>
-              </w:rPr>
-              <w:t xml:space="preserve">Inquilino</w:t>
-            </w:r>
-          </w:p>
-        </w:tc>
-        <w:tc>
-          <w:tcPr>
-            <w:tcW w:w="5500" w:type="dxa"/>
-            <w:tcBorders>
-              <w:top w:val="single" w:sz="4" w:color="CCCCCC"/>
-              <w:left w:val="single" w:sz="4" w:color="CCCCCC"/>
-              <w:bottom w:val="single" w:sz="4" w:color="CCCCCC"/>
-              <w:right w:val="single" w:sz="4" w:color="CCCCCC"/>
-            </w:tcBorders>
-            <w:vAlign w:val="center"/>
-          </w:tcPr>
-          <w:p>
-            <w:pPr>
-              <w:spacing w:before="0" w:after="0" w:line="220" w:lineRule="auto"/>
+              <w:spacing w:before="0" w:after="0" w:line="240" w:lineRule="auto"/>
             </w:pPr>
             <w:r>
               <w:rPr>
                 <w:rFonts w:ascii="Arial" w:hAnsi="Arial" w:cs="Arial"/>
                 <w:sz w:val="20"/>
                 <w:szCs w:val="20"/>
+                <w:color w:val="555555"/>
+              </w:rPr>
+              <w:t xml:space="preserve">Inquilino</w:t>
+            </w:r>
+          </w:p>
+        </w:tc>
+        <w:tc>
+          <w:tcPr>
+            <w:tcW w:w="5500" w:type="dxa"/>
+            <w:tcBorders>
+              <w:top w:val="single" w:sz="4" w:color="CCCCCC"/>
+              <w:left w:val="single" w:sz="4" w:color="CCCCCC"/>
+              <w:bottom w:val="single" w:sz="4" w:color="CCCCCC"/>
+              <w:right w:val="single" w:sz="4" w:color="CCCCCC"/>
+            </w:tcBorders>
+            <w:vAlign w:val="center"/>
+          </w:tcPr>
+          <w:p>
+            <w:pPr>
+              <w:spacing w:before="0" w:after="0" w:line="240" w:lineRule="auto"/>
+            </w:pPr>
+            <w:r>
+              <w:rPr>
+                <w:rFonts w:ascii="Arial" w:hAnsi="Arial" w:cs="Arial"/>
+                <w:sz w:val="22"/>
+                <w:szCs w:val="22"/>
                 <w:color w:val="333333"/>
               </w:rPr>
               <w:t xml:space="preserve">{inquilino}</w:t>
@@ -271,39 +271,39 @@
           </w:tcPr>
           <w:p>
             <w:pPr>
-              <w:spacing w:before="0" w:after="0" w:line="220" w:lineRule="auto"/>
-            </w:pPr>
-            <w:r>
-              <w:rPr>
-                <w:rFonts w:ascii="Arial" w:hAnsi="Arial" w:cs="Arial"/>
-                <w:sz w:val="18"/>
-                <w:szCs w:val="18"/>
-                <w:color w:val="555555"/>
-              </w:rPr>
-              <w:t xml:space="preserve">Local</w:t>
-            </w:r>
-          </w:p>
-        </w:tc>
-        <w:tc>
-          <w:tcPr>
-            <w:tcW w:w="5500" w:type="dxa"/>
-            <w:tcBorders>
-              <w:top w:val="single" w:sz="4" w:color="CCCCCC"/>
-              <w:left w:val="single" w:sz="4" w:color="CCCCCC"/>
-              <w:bottom w:val="single" w:sz="4" w:color="CCCCCC"/>
-              <w:right w:val="single" w:sz="4" w:color="CCCCCC"/>
-            </w:tcBorders>
-            <w:vAlign w:val="center"/>
-          </w:tcPr>
-          <w:p>
-            <w:pPr>
-              <w:spacing w:before="0" w:after="0" w:line="220" w:lineRule="auto"/>
+              <w:spacing w:before="0" w:after="0" w:line="240" w:lineRule="auto"/>
             </w:pPr>
             <w:r>
               <w:rPr>
                 <w:rFonts w:ascii="Arial" w:hAnsi="Arial" w:cs="Arial"/>
                 <w:sz w:val="20"/>
                 <w:szCs w:val="20"/>
+                <w:color w:val="555555"/>
+              </w:rPr>
+              <w:t xml:space="preserve">Local</w:t>
+            </w:r>
+          </w:p>
+        </w:tc>
+        <w:tc>
+          <w:tcPr>
+            <w:tcW w:w="5500" w:type="dxa"/>
+            <w:tcBorders>
+              <w:top w:val="single" w:sz="4" w:color="CCCCCC"/>
+              <w:left w:val="single" w:sz="4" w:color="CCCCCC"/>
+              <w:bottom w:val="single" w:sz="4" w:color="CCCCCC"/>
+              <w:right w:val="single" w:sz="4" w:color="CCCCCC"/>
+            </w:tcBorders>
+            <w:vAlign w:val="center"/>
+          </w:tcPr>
+          <w:p>
+            <w:pPr>
+              <w:spacing w:before="0" w:after="0" w:line="240" w:lineRule="auto"/>
+            </w:pPr>
+            <w:r>
+              <w:rPr>
+                <w:rFonts w:ascii="Arial" w:hAnsi="Arial" w:cs="Arial"/>
+                <w:sz w:val="22"/>
+                <w:szCs w:val="22"/>
                 <w:color w:val="333333"/>
               </w:rPr>
               <w:t xml:space="preserve">{local}</w:t>
@@ -329,39 +329,39 @@
           </w:tcPr>
           <w:p>
             <w:pPr>
-              <w:spacing w:before="0" w:after="0" w:line="220" w:lineRule="auto"/>
-            </w:pPr>
-            <w:r>
-              <w:rPr>
-                <w:rFonts w:ascii="Arial" w:hAnsi="Arial" w:cs="Arial"/>
-                <w:sz w:val="18"/>
-                <w:szCs w:val="18"/>
-                <w:color w:val="555555"/>
-              </w:rPr>
-              <w:t xml:space="preserve">Período</w:t>
-            </w:r>
-          </w:p>
-        </w:tc>
-        <w:tc>
-          <w:tcPr>
-            <w:tcW w:w="5500" w:type="dxa"/>
-            <w:tcBorders>
-              <w:top w:val="single" w:sz="4" w:color="CCCCCC"/>
-              <w:left w:val="single" w:sz="4" w:color="CCCCCC"/>
-              <w:bottom w:val="single" w:sz="4" w:color="CCCCCC"/>
-              <w:right w:val="single" w:sz="4" w:color="CCCCCC"/>
-            </w:tcBorders>
-            <w:vAlign w:val="center"/>
-          </w:tcPr>
-          <w:p>
-            <w:pPr>
-              <w:spacing w:before="0" w:after="0" w:line="220" w:lineRule="auto"/>
+              <w:spacing w:before="0" w:after="0" w:line="240" w:lineRule="auto"/>
             </w:pPr>
             <w:r>
               <w:rPr>
                 <w:rFonts w:ascii="Arial" w:hAnsi="Arial" w:cs="Arial"/>
                 <w:sz w:val="20"/>
                 <w:szCs w:val="20"/>
+                <w:color w:val="555555"/>
+              </w:rPr>
+              <w:t xml:space="preserve">Período</w:t>
+            </w:r>
+          </w:p>
+        </w:tc>
+        <w:tc>
+          <w:tcPr>
+            <w:tcW w:w="5500" w:type="dxa"/>
+            <w:tcBorders>
+              <w:top w:val="single" w:sz="4" w:color="CCCCCC"/>
+              <w:left w:val="single" w:sz="4" w:color="CCCCCC"/>
+              <w:bottom w:val="single" w:sz="4" w:color="CCCCCC"/>
+              <w:right w:val="single" w:sz="4" w:color="CCCCCC"/>
+            </w:tcBorders>
+            <w:vAlign w:val="center"/>
+          </w:tcPr>
+          <w:p>
+            <w:pPr>
+              <w:spacing w:before="0" w:after="0" w:line="240" w:lineRule="auto"/>
+            </w:pPr>
+            <w:r>
+              <w:rPr>
+                <w:rFonts w:ascii="Arial" w:hAnsi="Arial" w:cs="Arial"/>
+                <w:sz w:val="22"/>
+                <w:szCs w:val="22"/>
                 <w:color w:val="333333"/>
               </w:rPr>
               <w:t xml:space="preserve">{periodo}</w:t>
@@ -387,39 +387,39 @@
           </w:tcPr>
           <w:p>
             <w:pPr>
-              <w:spacing w:before="0" w:after="0" w:line="220" w:lineRule="auto"/>
-            </w:pPr>
-            <w:r>
-              <w:rPr>
-                <w:rFonts w:ascii="Arial" w:hAnsi="Arial" w:cs="Arial"/>
-                <w:sz w:val="18"/>
-                <w:szCs w:val="18"/>
-                <w:color w:val="555555"/>
-              </w:rPr>
-              <w:t xml:space="preserve">Fecha de emisión</w:t>
-            </w:r>
-          </w:p>
-        </w:tc>
-        <w:tc>
-          <w:tcPr>
-            <w:tcW w:w="5500" w:type="dxa"/>
-            <w:tcBorders>
-              <w:top w:val="single" w:sz="4" w:color="CCCCCC"/>
-              <w:left w:val="single" w:sz="4" w:color="CCCCCC"/>
-              <w:bottom w:val="single" w:sz="4" w:color="CCCCCC"/>
-              <w:right w:val="single" w:sz="4" w:color="CCCCCC"/>
-            </w:tcBorders>
-            <w:vAlign w:val="center"/>
-          </w:tcPr>
-          <w:p>
-            <w:pPr>
-              <w:spacing w:before="0" w:after="0" w:line="220" w:lineRule="auto"/>
+              <w:spacing w:before="0" w:after="0" w:line="240" w:lineRule="auto"/>
             </w:pPr>
             <w:r>
               <w:rPr>
                 <w:rFonts w:ascii="Arial" w:hAnsi="Arial" w:cs="Arial"/>
                 <w:sz w:val="20"/>
                 <w:szCs w:val="20"/>
+                <w:color w:val="555555"/>
+              </w:rPr>
+              <w:t xml:space="preserve">Fecha de emisión</w:t>
+            </w:r>
+          </w:p>
+        </w:tc>
+        <w:tc>
+          <w:tcPr>
+            <w:tcW w:w="5500" w:type="dxa"/>
+            <w:tcBorders>
+              <w:top w:val="single" w:sz="4" w:color="CCCCCC"/>
+              <w:left w:val="single" w:sz="4" w:color="CCCCCC"/>
+              <w:bottom w:val="single" w:sz="4" w:color="CCCCCC"/>
+              <w:right w:val="single" w:sz="4" w:color="CCCCCC"/>
+            </w:tcBorders>
+            <w:vAlign w:val="center"/>
+          </w:tcPr>
+          <w:p>
+            <w:pPr>
+              <w:spacing w:before="0" w:after="0" w:line="240" w:lineRule="auto"/>
+            </w:pPr>
+            <w:r>
+              <w:rPr>
+                <w:rFonts w:ascii="Arial" w:hAnsi="Arial" w:cs="Arial"/>
+                <w:sz w:val="22"/>
+                <w:szCs w:val="22"/>
                 <w:color w:val="333333"/>
               </w:rPr>
               <w:t xml:space="preserve">{fechaEmision}</w:t>
@@ -430,7 +430,7 @@
     </w:tbl>
     <w:p>
       <w:pPr>
-        <w:spacing w:before="120" w:after="20" w:line="240" w:lineRule="auto"/>
+        <w:spacing w:before="180" w:after="40" w:line="240" w:lineRule="auto"/>
         <w:pBdr>
           <w:bottom w:val="single" w:sz="12" w:space="2" w:color="1E7A8A"/>
         </w:pBdr>
@@ -439,8 +439,8 @@
         <w:rPr>
           <w:rFonts w:ascii="Arial" w:hAnsi="Arial" w:cs="Arial"/>
           <w:b/>
-          <w:sz w:val="20"/>
-          <w:szCs w:val="20"/>
+          <w:sz w:val="22"/>
+          <w:szCs w:val="22"/>
           <w:color w:val="1E7A8A"/>
           <w:spacing w:val="40"/>
         </w:rPr>
@@ -460,10 +460,10 @@
           <w:insideV w:val="single" w:sz="4" w:color="CCCCCC"/>
         </w:tblBorders>
         <w:tblCellMar>
-          <w:top w:w="20" w:type="dxa"/>
-          <w:left w:w="80" w:type="dxa"/>
-          <w:bottom w:w="20" w:type="dxa"/>
-          <w:right w:w="80" w:type="dxa"/>
+          <w:top w:w="60" w:type="dxa"/>
+          <w:left w:w="90" w:type="dxa"/>
+          <w:bottom w:w="60" w:type="dxa"/>
+          <w:right w:w="90" w:type="dxa"/>
         </w:tblCellMar>
       </w:tblPr>
       <w:tblGrid>
@@ -489,15 +489,15 @@
           </w:tcPr>
           <w:p>
             <w:pPr>
-              <w:spacing w:before="0" w:after="0" w:line="220" w:lineRule="auto"/>
+              <w:spacing w:before="0" w:after="0" w:line="240" w:lineRule="auto"/>
               <w:jc w:val="center"/>
             </w:pPr>
             <w:r>
               <w:rPr>
                 <w:rFonts w:ascii="Arial" w:hAnsi="Arial" w:cs="Arial"/>
                 <w:b/>
-                <w:sz w:val="16"/>
-                <w:szCs w:val="16"/>
+                <w:sz w:val="18"/>
+                <w:szCs w:val="18"/>
                 <w:color w:val="F37A72"/>
               </w:rPr>
               <w:t xml:space="preserve">LECTURA ANTERIOR (kWh)</w:t>
@@ -518,15 +518,15 @@
           </w:tcPr>
           <w:p>
             <w:pPr>
-              <w:spacing w:before="0" w:after="0" w:line="220" w:lineRule="auto"/>
+              <w:spacing w:before="0" w:after="0" w:line="240" w:lineRule="auto"/>
               <w:jc w:val="center"/>
             </w:pPr>
             <w:r>
               <w:rPr>
                 <w:rFonts w:ascii="Arial" w:hAnsi="Arial" w:cs="Arial"/>
                 <w:b/>
-                <w:sz w:val="16"/>
-                <w:szCs w:val="16"/>
+                <w:sz w:val="18"/>
+                <w:szCs w:val="18"/>
                 <w:color w:val="F37A72"/>
               </w:rPr>
               <w:t xml:space="preserve">LECTURA ACTUAL (kWh)</w:t>
@@ -547,15 +547,15 @@
           </w:tcPr>
           <w:p>
             <w:pPr>
-              <w:spacing w:before="0" w:after="0" w:line="220" w:lineRule="auto"/>
+              <w:spacing w:before="0" w:after="0" w:line="240" w:lineRule="auto"/>
               <w:jc w:val="center"/>
             </w:pPr>
             <w:r>
               <w:rPr>
                 <w:rFonts w:ascii="Arial" w:hAnsi="Arial" w:cs="Arial"/>
                 <w:b/>
-                <w:sz w:val="16"/>
-                <w:szCs w:val="16"/>
+                <w:sz w:val="18"/>
+                <w:szCs w:val="18"/>
                 <w:color w:val="F37A72"/>
               </w:rPr>
               <w:t xml:space="preserve">CONSUMO (kWh)</w:t>
@@ -580,14 +580,14 @@
           </w:tcPr>
           <w:p>
             <w:pPr>
-              <w:spacing w:before="0" w:after="0" w:line="220" w:lineRule="auto"/>
+              <w:spacing w:before="0" w:after="0" w:line="240" w:lineRule="auto"/>
               <w:jc w:val="center"/>
             </w:pPr>
             <w:r>
               <w:rPr>
                 <w:rFonts w:ascii="Arial" w:hAnsi="Arial" w:cs="Arial"/>
-                <w:sz w:val="20"/>
-                <w:szCs w:val="20"/>
+                <w:sz w:val="22"/>
+                <w:szCs w:val="22"/>
                 <w:color w:val="333333"/>
               </w:rPr>
               <w:t xml:space="preserve">{lecturaAnterior}</w:t>
@@ -607,14 +607,14 @@
           </w:tcPr>
           <w:p>
             <w:pPr>
-              <w:spacing w:before="0" w:after="0" w:line="220" w:lineRule="auto"/>
+              <w:spacing w:before="0" w:after="0" w:line="240" w:lineRule="auto"/>
               <w:jc w:val="center"/>
             </w:pPr>
             <w:r>
               <w:rPr>
                 <w:rFonts w:ascii="Arial" w:hAnsi="Arial" w:cs="Arial"/>
-                <w:sz w:val="20"/>
-                <w:szCs w:val="20"/>
+                <w:sz w:val="22"/>
+                <w:szCs w:val="22"/>
                 <w:color w:val="333333"/>
               </w:rPr>
               <w:t xml:space="preserve">{lecturaActual}</w:t>
@@ -634,15 +634,15 @@
           </w:tcPr>
           <w:p>
             <w:pPr>
-              <w:spacing w:before="0" w:after="0" w:line="220" w:lineRule="auto"/>
+              <w:spacing w:before="0" w:after="0" w:line="240" w:lineRule="auto"/>
               <w:jc w:val="center"/>
             </w:pPr>
             <w:r>
               <w:rPr>
                 <w:rFonts w:ascii="Arial" w:hAnsi="Arial" w:cs="Arial"/>
                 <w:b/>
-                <w:sz w:val="20"/>
-                <w:szCs w:val="20"/>
+                <w:sz w:val="22"/>
+                <w:szCs w:val="22"/>
                 <w:color w:val="333333"/>
               </w:rPr>
               <w:t xml:space="preserve">{consumo}</w:t>
@@ -653,7 +653,7 @@
     </w:tbl>
     <w:p>
       <w:pPr>
-        <w:spacing w:before="120" w:after="20" w:line="240" w:lineRule="auto"/>
+        <w:spacing w:before="180" w:after="40" w:line="240" w:lineRule="auto"/>
         <w:pBdr>
           <w:bottom w:val="single" w:sz="12" w:space="2" w:color="1E7A8A"/>
         </w:pBdr>
@@ -662,8 +662,8 @@
         <w:rPr>
           <w:rFonts w:ascii="Arial" w:hAnsi="Arial" w:cs="Arial"/>
           <w:b/>
-          <w:sz w:val="20"/>
-          <w:szCs w:val="20"/>
+          <w:sz w:val="22"/>
+          <w:szCs w:val="22"/>
           <w:color w:val="1E7A8A"/>
           <w:spacing w:val="40"/>
         </w:rPr>
@@ -683,10 +683,10 @@
           <w:insideV w:val="single" w:sz="4" w:color="CCCCCC"/>
         </w:tblBorders>
         <w:tblCellMar>
-          <w:top w:w="20" w:type="dxa"/>
-          <w:left w:w="80" w:type="dxa"/>
-          <w:bottom w:w="20" w:type="dxa"/>
-          <w:right w:w="80" w:type="dxa"/>
+          <w:top w:w="60" w:type="dxa"/>
+          <w:left w:w="90" w:type="dxa"/>
+          <w:bottom w:w="60" w:type="dxa"/>
+          <w:right w:w="90" w:type="dxa"/>
         </w:tblCellMar>
       </w:tblPr>
       <w:tblGrid>
@@ -712,14 +712,14 @@
           </w:tcPr>
           <w:p>
             <w:pPr>
-              <w:spacing w:before="0" w:after="0" w:line="220" w:lineRule="auto"/>
+              <w:spacing w:before="0" w:after="0" w:line="240" w:lineRule="auto"/>
             </w:pPr>
             <w:r>
               <w:rPr>
                 <w:rFonts w:ascii="Arial" w:hAnsi="Arial" w:cs="Arial"/>
                 <w:b/>
-                <w:sz w:val="16"/>
-                <w:szCs w:val="16"/>
+                <w:sz w:val="18"/>
+                <w:szCs w:val="18"/>
                 <w:color w:val="F37A72"/>
               </w:rPr>
               <w:t xml:space="preserve">DETALLE</w:t>
@@ -740,15 +740,15 @@
           </w:tcPr>
           <w:p>
             <w:pPr>
-              <w:spacing w:before="0" w:after="0" w:line="220" w:lineRule="auto"/>
+              <w:spacing w:before="0" w:after="0" w:line="240" w:lineRule="auto"/>
               <w:jc w:val="center"/>
             </w:pPr>
             <w:r>
               <w:rPr>
                 <w:rFonts w:ascii="Arial" w:hAnsi="Arial" w:cs="Arial"/>
                 <w:b/>
-                <w:sz w:val="16"/>
-                <w:szCs w:val="16"/>
+                <w:sz w:val="18"/>
+                <w:szCs w:val="18"/>
                 <w:color w:val="F37A72"/>
               </w:rPr>
               <w:t xml:space="preserve">VALOR</w:t>
@@ -769,15 +769,15 @@
           </w:tcPr>
           <w:p>
             <w:pPr>
-              <w:spacing w:before="0" w:after="0" w:line="220" w:lineRule="auto"/>
+              <w:spacing w:before="0" w:after="0" w:line="240" w:lineRule="auto"/>
               <w:jc w:val="center"/>
             </w:pPr>
             <w:r>
               <w:rPr>
                 <w:rFonts w:ascii="Arial" w:hAnsi="Arial" w:cs="Arial"/>
                 <w:b/>
-                <w:sz w:val="16"/>
-                <w:szCs w:val="16"/>
+                <w:sz w:val="18"/>
+                <w:szCs w:val="18"/>
                 <w:color w:val="F37A72"/>
               </w:rPr>
               <w:t xml:space="preserve">MONTO (L)</w:t>
@@ -802,13 +802,13 @@
           </w:tcPr>
           <w:p>
             <w:pPr>
-              <w:spacing w:before="0" w:after="0" w:line="220" w:lineRule="auto"/>
-            </w:pPr>
-            <w:r>
-              <w:rPr>
-                <w:rFonts w:ascii="Arial" w:hAnsi="Arial" w:cs="Arial"/>
-                <w:sz w:val="18"/>
-                <w:szCs w:val="18"/>
+              <w:spacing w:before="0" w:after="0" w:line="240" w:lineRule="auto"/>
+            </w:pPr>
+            <w:r>
+              <w:rPr>
+                <w:rFonts w:ascii="Arial" w:hAnsi="Arial" w:cs="Arial"/>
+                <w:sz w:val="20"/>
+                <w:szCs w:val="20"/>
                 <w:color w:val="333333"/>
               </w:rPr>
               <w:t xml:space="preserve">Factura ENEE estimada (plaza)</w:t>
@@ -828,14 +828,14 @@
           </w:tcPr>
           <w:p>
             <w:pPr>
-              <w:spacing w:before="0" w:after="0" w:line="220" w:lineRule="auto"/>
+              <w:spacing w:before="0" w:after="0" w:line="240" w:lineRule="auto"/>
               <w:jc w:val="center"/>
             </w:pPr>
             <w:r>
               <w:rPr>
                 <w:rFonts w:ascii="Arial" w:hAnsi="Arial" w:cs="Arial"/>
-                <w:sz w:val="18"/>
-                <w:szCs w:val="18"/>
+                <w:sz w:val="20"/>
+                <w:szCs w:val="20"/>
                 <w:color w:val="555555"/>
               </w:rPr>
               <w:t xml:space="preserve">{kWhPlaza} kWh</w:t>
@@ -855,14 +855,14 @@
           </w:tcPr>
           <w:p>
             <w:pPr>
-              <w:spacing w:before="0" w:after="0" w:line="220" w:lineRule="auto"/>
+              <w:spacing w:before="0" w:after="0" w:line="240" w:lineRule="auto"/>
               <w:jc w:val="right"/>
             </w:pPr>
             <w:r>
               <w:rPr>
                 <w:rFonts w:ascii="Arial" w:hAnsi="Arial" w:cs="Arial"/>
-                <w:sz w:val="18"/>
-                <w:szCs w:val="18"/>
+                <w:sz w:val="20"/>
+                <w:szCs w:val="20"/>
                 <w:color w:val="333333"/>
               </w:rPr>
               <w:t xml:space="preserve">{facturaEnee}</w:t>
@@ -887,13 +887,13 @@
           </w:tcPr>
           <w:p>
             <w:pPr>
-              <w:spacing w:before="0" w:after="0" w:line="220" w:lineRule="auto"/>
-            </w:pPr>
-            <w:r>
-              <w:rPr>
-                <w:rFonts w:ascii="Arial" w:hAnsi="Arial" w:cs="Arial"/>
-                <w:sz w:val="18"/>
-                <w:szCs w:val="18"/>
+              <w:spacing w:before="0" w:after="0" w:line="240" w:lineRule="auto"/>
+            </w:pPr>
+            <w:r>
+              <w:rPr>
+                <w:rFonts w:ascii="Arial" w:hAnsi="Arial" w:cs="Arial"/>
+                <w:sz w:val="20"/>
+                <w:szCs w:val="20"/>
                 <w:color w:val="333333"/>
               </w:rPr>
               <w:t xml:space="preserve">Tarifa efectiva de energía</w:t>
@@ -913,14 +913,14 @@
           </w:tcPr>
           <w:p>
             <w:pPr>
-              <w:spacing w:before="0" w:after="0" w:line="220" w:lineRule="auto"/>
+              <w:spacing w:before="0" w:after="0" w:line="240" w:lineRule="auto"/>
               <w:jc w:val="center"/>
             </w:pPr>
             <w:r>
               <w:rPr>
                 <w:rFonts w:ascii="Arial" w:hAnsi="Arial" w:cs="Arial"/>
-                <w:sz w:val="18"/>
-                <w:szCs w:val="18"/>
+                <w:sz w:val="20"/>
+                <w:szCs w:val="20"/>
                 <w:color w:val="555555"/>
               </w:rPr>
               <w:t xml:space="preserve">L/kWh</w:t>
@@ -940,14 +940,14 @@
           </w:tcPr>
           <w:p>
             <w:pPr>
-              <w:spacing w:before="0" w:after="0" w:line="220" w:lineRule="auto"/>
+              <w:spacing w:before="0" w:after="0" w:line="240" w:lineRule="auto"/>
               <w:jc w:val="right"/>
             </w:pPr>
             <w:r>
               <w:rPr>
                 <w:rFonts w:ascii="Arial" w:hAnsi="Arial" w:cs="Arial"/>
-                <w:sz w:val="18"/>
-                <w:szCs w:val="18"/>
+                <w:sz w:val="20"/>
+                <w:szCs w:val="20"/>
                 <w:color w:val="333333"/>
               </w:rPr>
               <w:t xml:space="preserve">{tarifa}</w:t>
@@ -972,13 +972,13 @@
           </w:tcPr>
           <w:p>
             <w:pPr>
-              <w:spacing w:before="0" w:after="0" w:line="220" w:lineRule="auto"/>
-            </w:pPr>
-            <w:r>
-              <w:rPr>
-                <w:rFonts w:ascii="Arial" w:hAnsi="Arial" w:cs="Arial"/>
-                <w:sz w:val="18"/>
-                <w:szCs w:val="18"/>
+              <w:spacing w:before="0" w:after="0" w:line="240" w:lineRule="auto"/>
+            </w:pPr>
+            <w:r>
+              <w:rPr>
+                <w:rFonts w:ascii="Arial" w:hAnsi="Arial" w:cs="Arial"/>
+                <w:sz w:val="20"/>
+                <w:szCs w:val="20"/>
                 <w:color w:val="333333"/>
               </w:rPr>
               <w:t xml:space="preserve">Energía consumida</w:t>
@@ -998,14 +998,14 @@
           </w:tcPr>
           <w:p>
             <w:pPr>
-              <w:spacing w:before="0" w:after="0" w:line="220" w:lineRule="auto"/>
+              <w:spacing w:before="0" w:after="0" w:line="240" w:lineRule="auto"/>
               <w:jc w:val="center"/>
             </w:pPr>
             <w:r>
               <w:rPr>
                 <w:rFonts w:ascii="Arial" w:hAnsi="Arial" w:cs="Arial"/>
-                <w:sz w:val="18"/>
-                <w:szCs w:val="18"/>
+                <w:sz w:val="20"/>
+                <w:szCs w:val="20"/>
                 <w:color w:val="555555"/>
               </w:rPr>
               <w:t xml:space="preserve">{consumo} × {tarifa}</w:t>
@@ -1025,14 +1025,14 @@
           </w:tcPr>
           <w:p>
             <w:pPr>
-              <w:spacing w:before="0" w:after="0" w:line="220" w:lineRule="auto"/>
+              <w:spacing w:before="0" w:after="0" w:line="240" w:lineRule="auto"/>
               <w:jc w:val="right"/>
             </w:pPr>
             <w:r>
               <w:rPr>
                 <w:rFonts w:ascii="Arial" w:hAnsi="Arial" w:cs="Arial"/>
-                <w:sz w:val="18"/>
-                <w:szCs w:val="18"/>
+                <w:sz w:val="20"/>
+                <w:szCs w:val="20"/>
                 <w:color w:val="333333"/>
               </w:rPr>
               <w:t xml:space="preserve">{montoEnergia}</w:t>
@@ -1059,14 +1059,14 @@
           </w:tcPr>
           <w:p>
             <w:pPr>
-              <w:spacing w:before="0" w:after="0" w:line="220" w:lineRule="auto"/>
+              <w:spacing w:before="0" w:after="0" w:line="240" w:lineRule="auto"/>
             </w:pPr>
             <w:r>
               <w:rPr>
                 <w:rFonts w:ascii="Arial" w:hAnsi="Arial" w:cs="Arial"/>
                 <w:b/>
-                <w:sz w:val="20"/>
-                <w:szCs w:val="20"/>
+                <w:sz w:val="24"/>
+                <w:szCs w:val="24"/>
                 <w:color w:val="FFFFFF"/>
               </w:rPr>
               <w:t xml:space="preserve">TOTAL A PAGAR</w:t>
@@ -1088,7 +1088,7 @@
           </w:tcPr>
           <w:p>
             <w:pPr>
-              <w:spacing w:before="0" w:after="0" w:line="220" w:lineRule="auto"/>
+              <w:spacing w:before="0" w:after="0" w:line="240" w:lineRule="auto"/>
             </w:pPr>
           </w:p>
         </w:tc>
@@ -1106,15 +1106,15 @@
           </w:tcPr>
           <w:p>
             <w:pPr>
-              <w:spacing w:before="0" w:after="0" w:line="220" w:lineRule="auto"/>
+              <w:spacing w:before="0" w:after="0" w:line="240" w:lineRule="auto"/>
               <w:jc w:val="right"/>
             </w:pPr>
             <w:r>
               <w:rPr>
                 <w:rFonts w:ascii="Arial" w:hAnsi="Arial" w:cs="Arial"/>
                 <w:b/>
-                <w:sz w:val="22"/>
-                <w:szCs w:val="22"/>
+                <w:sz w:val="26"/>
+                <w:szCs w:val="26"/>
                 <w:color w:val="FFFFFF"/>
               </w:rPr>
               <w:t xml:space="preserve">L  {total}</w:t>
@@ -1125,7 +1125,7 @@
     </w:tbl>
     <w:p>
       <w:pPr>
-        <w:spacing w:before="120" w:after="0" w:line="240" w:lineRule="auto"/>
+        <w:spacing w:before="180" w:after="0" w:line="240" w:lineRule="auto"/>
         <w:shd w:val="clear" w:color="auto" w:fill="FFFBEA"/>
         <w:ind w:left="180"/>
         <w:pBdr>
@@ -1136,8 +1136,8 @@
         <w:rPr>
           <w:rFonts w:ascii="Arial" w:hAnsi="Arial" w:cs="Arial"/>
           <w:b/>
-          <w:sz w:val="16"/>
-          <w:szCs w:val="16"/>
+          <w:sz w:val="18"/>
+          <w:szCs w:val="18"/>
           <w:color w:val="333333"/>
         </w:rPr>
         <w:t xml:space="preserve">Método de cálculo: </w:t>
@@ -1145,8 +1145,8 @@
       <w:r>
         <w:rPr>
           <w:rFonts w:ascii="Arial" w:hAnsi="Arial" w:cs="Arial"/>
-          <w:sz w:val="16"/>
-          <w:szCs w:val="16"/>
+          <w:sz w:val="18"/>
+          <w:szCs w:val="18"/>
           <w:color w:val="555555"/>
         </w:rPr>
         <w:t xml:space="preserve">El monto se obtiene prorrateando la factura ENEE de la plaza según el consumo real registrado en el submedidor de cada local. Este recibo no genera ISV.</w:t>

</xml_diff>

<commit_message>
fix: membrete homogeneo en recibos de luz y renta
El recibo de luz usaba el membrete viejo (imagen completa con el footer
grafico que tenia el telefono equivocado 8518). Ahora usa el mismo
approach que el de renta: header recortado + footer editable con el
telefono correcto (9462-8618).

Ademas corrige el espaciado: el titulo arrancaba pegado/montado sobre
la imagen del header (spaceBefore 110). Ahora arranca despejado
(spaceBefore 1300) y las secciones tienen mas aire. Aplicado a ambos.

Co-Authored-By: Claude Opus 4.7 (1M context) <noreply@anthropic.com>
</commit_message>
<xml_diff>
--- a/membrete-referencia/recibo-luz-template.docx
+++ b/membrete-referencia/recibo-luz-template.docx
@@ -2,9 +2,6 @@
 <file path=word/document.xml><?xml version="1.0" encoding="utf-8"?>
 <w:document xmlns:wpc="http://schemas.microsoft.com/office/word/2010/wordprocessingCanvas" xmlns:cx="http://schemas.microsoft.com/office/drawing/2014/chartex" xmlns:cx1="http://schemas.microsoft.com/office/drawing/2015/9/8/chartex" xmlns:cx2="http://schemas.microsoft.com/office/drawing/2015/10/21/chartex" xmlns:cx3="http://schemas.microsoft.com/office/drawing/2016/5/9/chartex" xmlns:cx4="http://schemas.microsoft.com/office/drawing/2016/5/10/chartex" xmlns:cx5="http://schemas.microsoft.com/office/drawing/2016/5/11/chartex" xmlns:cx6="http://schemas.microsoft.com/office/drawing/2016/5/12/chartex" xmlns:cx7="http://schemas.microsoft.com/office/drawing/2016/5/13/chartex" xmlns:cx8="http://schemas.microsoft.com/office/drawing/2016/5/14/chartex" xmlns:mc="http://schemas.openxmlformats.org/markup-compatibility/2006" xmlns:aink="http://schemas.microsoft.com/office/drawing/2016/ink" xmlns:am3d="http://schemas.microsoft.com/office/drawing/2017/model3d" xmlns:o="urn:schemas-microsoft-com:office:office" xmlns:oel="http://schemas.microsoft.com/office/2019/extlst" xmlns:r="http://schemas.openxmlformats.org/officeDocument/2006/relationships" xmlns:m="http://schemas.openxmlformats.org/officeDocument/2006/math" xmlns:v="urn:schemas-microsoft-com:vml" xmlns:wp14="http://schemas.microsoft.com/office/word/2010/wordprocessingDrawing" xmlns:wp="http://schemas.openxmlformats.org/drawingml/2006/wordprocessingDrawing" xmlns:w10="urn:schemas-microsoft-com:office:word" xmlns:w="http://schemas.openxmlformats.org/wordprocessingml/2006/main" xmlns:w14="http://schemas.microsoft.com/office/word/2010/wordml" xmlns:w15="http://schemas.microsoft.com/office/word/2012/wordml" xmlns:w16cex="http://schemas.microsoft.com/office/word/2018/wordml/cex" xmlns:w16cid="http://schemas.microsoft.com/office/word/2016/wordml/cid" xmlns:w16="http://schemas.microsoft.com/office/word/2018/wordml" xmlns:w16du="http://schemas.microsoft.com/office/word/2023/wordml/word16du" xmlns:w16sdtdh="http://schemas.microsoft.com/office/word/2020/wordml/sdtdatahash" xmlns:w16sdtfl="http://schemas.microsoft.com/office/word/2024/wordml/sdtformatlock" xmlns:w16se="http://schemas.microsoft.com/office/word/2015/wordml/symex" xmlns:wpg="http://schemas.microsoft.com/office/word/2010/wordprocessingGroup" xmlns:wpi="http://schemas.microsoft.com/office/word/2010/wordprocessingInk" xmlns:wne="http://schemas.microsoft.com/office/word/2006/wordml" xmlns:wps="http://schemas.microsoft.com/office/word/2010/wordprocessingShape" mc:Ignorable="w14 w15 w16se w16cid w16 w16cex w16sdtdh w16sdtfl w16du wp14">
   <w:body>
-    <w:p/>
-    <w:p/>
-    <w:p/>
     <w:p>
       <w:pPr>
         <w:rPr>
@@ -24,7 +21,7 @@
             <wp:positionV relativeFrom="margin">
               <wp:posOffset>-721995</wp:posOffset>
             </wp:positionV>
-            <wp:extent cx="7725410" cy="9872303"/>
+            <wp:extent cx="7725410" cy="1332761"/>
             <wp:effectExtent l="0" t="0" r="8890" b="0"/>
             <wp:wrapNone/>
             <wp:docPr id="1" name="Imagen 1"/>
@@ -46,6 +43,7 @@
                         </a:ext>
                       </a:extLst>
                     </a:blip>
+                    <a:srcRect t="0" b="86500" l="0" r="0"/>
                     <a:stretch>
                       <a:fillRect/>
                     </a:stretch>
@@ -53,7 +51,7 @@
                   <pic:spPr>
                     <a:xfrm>
                       <a:off x="0" y="0"/>
-                      <a:ext cx="7725410" cy="9872303"/>
+                      <a:ext cx="7725410" cy="1332761"/>
                     </a:xfrm>
                     <a:prstGeom prst="rect">
                       <a:avLst/>
@@ -79,19 +77,17 @@
         </w:rPr>
       </w:pPr>
     </w:p>
-    <w:p/>
-    <w:p/>
     <w:p>
       <w:pPr>
-        <w:spacing w:before="0" w:after="40" w:line="240" w:lineRule="auto"/>
+        <w:spacing w:before="1300" w:after="60" w:line="240" w:lineRule="auto"/>
         <w:jc w:val="center"/>
       </w:pPr>
       <w:r>
         <w:rPr>
           <w:rFonts w:ascii="Arial" w:hAnsi="Arial" w:cs="Arial"/>
           <w:b/>
-          <w:sz w:val="34"/>
-          <w:szCs w:val="34"/>
+          <w:sz w:val="40"/>
+          <w:szCs w:val="40"/>
           <w:color w:val="333333"/>
           <w:spacing w:val="60"/>
         </w:rPr>
@@ -100,14 +96,14 @@
     </w:p>
     <w:p>
       <w:pPr>
-        <w:spacing w:before="0" w:after="160" w:line="240" w:lineRule="auto"/>
+        <w:spacing w:before="0" w:after="260" w:line="240" w:lineRule="auto"/>
         <w:jc w:val="center"/>
       </w:pPr>
       <w:r>
         <w:rPr>
           <w:rFonts w:ascii="Arial" w:hAnsi="Arial" w:cs="Arial"/>
-          <w:sz w:val="18"/>
-          <w:szCs w:val="18"/>
+          <w:sz w:val="22"/>
+          <w:szCs w:val="22"/>
           <w:color w:val="555555"/>
           <w:spacing w:val="30"/>
         </w:rPr>
@@ -116,7 +112,7 @@
     </w:p>
     <w:tbl>
       <w:tblPr>
-        <w:tblW w:w="8500" w:type="dxa"/>
+        <w:tblW w:w="8800" w:type="dxa"/>
         <w:jc w:val="center"/>
         <w:tblBorders>
           <w:top w:val="single" w:sz="4" w:color="CCCCCC"/>
@@ -127,15 +123,15 @@
           <w:insideV w:val="single" w:sz="4" w:color="CCCCCC"/>
         </w:tblBorders>
         <w:tblCellMar>
-          <w:top w:w="60" w:type="dxa"/>
-          <w:left w:w="90" w:type="dxa"/>
-          <w:bottom w:w="60" w:type="dxa"/>
-          <w:right w:w="90" w:type="dxa"/>
+          <w:top w:w="120" w:type="dxa"/>
+          <w:left w:w="80" w:type="dxa"/>
+          <w:bottom w:w="120" w:type="dxa"/>
+          <w:right w:w="80" w:type="dxa"/>
         </w:tblCellMar>
       </w:tblPr>
       <w:tblGrid>
-        <w:gridCol w:w="3000"/>
-        <w:gridCol w:w="5500"/>
+        <w:gridCol w:w="2400"/>
+        <w:gridCol w:w="6400"/>
       </w:tblGrid>
       <w:tr>
         <w:trPr>
@@ -143,7 +139,7 @@
         </w:trPr>
         <w:tc>
           <w:tcPr>
-            <w:tcW w:w="3000" w:type="dxa"/>
+            <w:tcW w:w="2400" w:type="dxa"/>
             <w:shd w:val="clear" w:color="auto" w:fill="F0F0F0"/>
             <w:tcBorders>
               <w:top w:val="single" w:sz="4" w:color="CCCCCC"/>
@@ -155,7 +151,7 @@
           </w:tcPr>
           <w:p>
             <w:pPr>
-              <w:spacing w:before="0" w:after="0" w:line="240" w:lineRule="auto"/>
+              <w:spacing w:before="0" w:after="0" w:line="220" w:lineRule="auto"/>
             </w:pPr>
             <w:r>
               <w:rPr>
@@ -170,18 +166,18 @@
         </w:tc>
         <w:tc>
           <w:tcPr>
-            <w:tcW w:w="5500" w:type="dxa"/>
-            <w:tcBorders>
-              <w:top w:val="single" w:sz="4" w:color="CCCCCC"/>
-              <w:left w:val="single" w:sz="4" w:color="CCCCCC"/>
-              <w:bottom w:val="single" w:sz="4" w:color="CCCCCC"/>
-              <w:right w:val="single" w:sz="4" w:color="CCCCCC"/>
-            </w:tcBorders>
-            <w:vAlign w:val="center"/>
-          </w:tcPr>
-          <w:p>
-            <w:pPr>
-              <w:spacing w:before="0" w:after="0" w:line="240" w:lineRule="auto"/>
+            <w:tcW w:w="6400" w:type="dxa"/>
+            <w:tcBorders>
+              <w:top w:val="single" w:sz="4" w:color="CCCCCC"/>
+              <w:left w:val="single" w:sz="4" w:color="CCCCCC"/>
+              <w:bottom w:val="single" w:sz="4" w:color="CCCCCC"/>
+              <w:right w:val="single" w:sz="4" w:color="CCCCCC"/>
+            </w:tcBorders>
+            <w:vAlign w:val="center"/>
+          </w:tcPr>
+          <w:p>
+            <w:pPr>
+              <w:spacing w:before="0" w:after="0" w:line="220" w:lineRule="auto"/>
             </w:pPr>
             <w:r>
               <w:rPr>
@@ -201,7 +197,7 @@
         </w:trPr>
         <w:tc>
           <w:tcPr>
-            <w:tcW w:w="3000" w:type="dxa"/>
+            <w:tcW w:w="2400" w:type="dxa"/>
             <w:shd w:val="clear" w:color="auto" w:fill="F0F0F0"/>
             <w:tcBorders>
               <w:top w:val="single" w:sz="4" w:color="CCCCCC"/>
@@ -213,7 +209,7 @@
           </w:tcPr>
           <w:p>
             <w:pPr>
-              <w:spacing w:before="0" w:after="0" w:line="240" w:lineRule="auto"/>
+              <w:spacing w:before="0" w:after="0" w:line="220" w:lineRule="auto"/>
             </w:pPr>
             <w:r>
               <w:rPr>
@@ -228,18 +224,18 @@
         </w:tc>
         <w:tc>
           <w:tcPr>
-            <w:tcW w:w="5500" w:type="dxa"/>
-            <w:tcBorders>
-              <w:top w:val="single" w:sz="4" w:color="CCCCCC"/>
-              <w:left w:val="single" w:sz="4" w:color="CCCCCC"/>
-              <w:bottom w:val="single" w:sz="4" w:color="CCCCCC"/>
-              <w:right w:val="single" w:sz="4" w:color="CCCCCC"/>
-            </w:tcBorders>
-            <w:vAlign w:val="center"/>
-          </w:tcPr>
-          <w:p>
-            <w:pPr>
-              <w:spacing w:before="0" w:after="0" w:line="240" w:lineRule="auto"/>
+            <w:tcW w:w="6400" w:type="dxa"/>
+            <w:tcBorders>
+              <w:top w:val="single" w:sz="4" w:color="CCCCCC"/>
+              <w:left w:val="single" w:sz="4" w:color="CCCCCC"/>
+              <w:bottom w:val="single" w:sz="4" w:color="CCCCCC"/>
+              <w:right w:val="single" w:sz="4" w:color="CCCCCC"/>
+            </w:tcBorders>
+            <w:vAlign w:val="center"/>
+          </w:tcPr>
+          <w:p>
+            <w:pPr>
+              <w:spacing w:before="0" w:after="0" w:line="220" w:lineRule="auto"/>
             </w:pPr>
             <w:r>
               <w:rPr>
@@ -259,7 +255,7 @@
         </w:trPr>
         <w:tc>
           <w:tcPr>
-            <w:tcW w:w="3000" w:type="dxa"/>
+            <w:tcW w:w="2400" w:type="dxa"/>
             <w:shd w:val="clear" w:color="auto" w:fill="F0F0F0"/>
             <w:tcBorders>
               <w:top w:val="single" w:sz="4" w:color="CCCCCC"/>
@@ -271,7 +267,7 @@
           </w:tcPr>
           <w:p>
             <w:pPr>
-              <w:spacing w:before="0" w:after="0" w:line="240" w:lineRule="auto"/>
+              <w:spacing w:before="0" w:after="0" w:line="220" w:lineRule="auto"/>
             </w:pPr>
             <w:r>
               <w:rPr>
@@ -286,18 +282,18 @@
         </w:tc>
         <w:tc>
           <w:tcPr>
-            <w:tcW w:w="5500" w:type="dxa"/>
-            <w:tcBorders>
-              <w:top w:val="single" w:sz="4" w:color="CCCCCC"/>
-              <w:left w:val="single" w:sz="4" w:color="CCCCCC"/>
-              <w:bottom w:val="single" w:sz="4" w:color="CCCCCC"/>
-              <w:right w:val="single" w:sz="4" w:color="CCCCCC"/>
-            </w:tcBorders>
-            <w:vAlign w:val="center"/>
-          </w:tcPr>
-          <w:p>
-            <w:pPr>
-              <w:spacing w:before="0" w:after="0" w:line="240" w:lineRule="auto"/>
+            <w:tcW w:w="6400" w:type="dxa"/>
+            <w:tcBorders>
+              <w:top w:val="single" w:sz="4" w:color="CCCCCC"/>
+              <w:left w:val="single" w:sz="4" w:color="CCCCCC"/>
+              <w:bottom w:val="single" w:sz="4" w:color="CCCCCC"/>
+              <w:right w:val="single" w:sz="4" w:color="CCCCCC"/>
+            </w:tcBorders>
+            <w:vAlign w:val="center"/>
+          </w:tcPr>
+          <w:p>
+            <w:pPr>
+              <w:spacing w:before="0" w:after="0" w:line="220" w:lineRule="auto"/>
             </w:pPr>
             <w:r>
               <w:rPr>
@@ -317,7 +313,7 @@
         </w:trPr>
         <w:tc>
           <w:tcPr>
-            <w:tcW w:w="3000" w:type="dxa"/>
+            <w:tcW w:w="2400" w:type="dxa"/>
             <w:shd w:val="clear" w:color="auto" w:fill="F0F0F0"/>
             <w:tcBorders>
               <w:top w:val="single" w:sz="4" w:color="CCCCCC"/>
@@ -329,7 +325,7 @@
           </w:tcPr>
           <w:p>
             <w:pPr>
-              <w:spacing w:before="0" w:after="0" w:line="240" w:lineRule="auto"/>
+              <w:spacing w:before="0" w:after="0" w:line="220" w:lineRule="auto"/>
             </w:pPr>
             <w:r>
               <w:rPr>
@@ -344,18 +340,18 @@
         </w:tc>
         <w:tc>
           <w:tcPr>
-            <w:tcW w:w="5500" w:type="dxa"/>
-            <w:tcBorders>
-              <w:top w:val="single" w:sz="4" w:color="CCCCCC"/>
-              <w:left w:val="single" w:sz="4" w:color="CCCCCC"/>
-              <w:bottom w:val="single" w:sz="4" w:color="CCCCCC"/>
-              <w:right w:val="single" w:sz="4" w:color="CCCCCC"/>
-            </w:tcBorders>
-            <w:vAlign w:val="center"/>
-          </w:tcPr>
-          <w:p>
-            <w:pPr>
-              <w:spacing w:before="0" w:after="0" w:line="240" w:lineRule="auto"/>
+            <w:tcW w:w="6400" w:type="dxa"/>
+            <w:tcBorders>
+              <w:top w:val="single" w:sz="4" w:color="CCCCCC"/>
+              <w:left w:val="single" w:sz="4" w:color="CCCCCC"/>
+              <w:bottom w:val="single" w:sz="4" w:color="CCCCCC"/>
+              <w:right w:val="single" w:sz="4" w:color="CCCCCC"/>
+            </w:tcBorders>
+            <w:vAlign w:val="center"/>
+          </w:tcPr>
+          <w:p>
+            <w:pPr>
+              <w:spacing w:before="0" w:after="0" w:line="220" w:lineRule="auto"/>
             </w:pPr>
             <w:r>
               <w:rPr>
@@ -375,7 +371,7 @@
         </w:trPr>
         <w:tc>
           <w:tcPr>
-            <w:tcW w:w="3000" w:type="dxa"/>
+            <w:tcW w:w="2400" w:type="dxa"/>
             <w:shd w:val="clear" w:color="auto" w:fill="F0F0F0"/>
             <w:tcBorders>
               <w:top w:val="single" w:sz="4" w:color="CCCCCC"/>
@@ -387,7 +383,7 @@
           </w:tcPr>
           <w:p>
             <w:pPr>
-              <w:spacing w:before="0" w:after="0" w:line="240" w:lineRule="auto"/>
+              <w:spacing w:before="0" w:after="0" w:line="220" w:lineRule="auto"/>
             </w:pPr>
             <w:r>
               <w:rPr>
@@ -402,18 +398,18 @@
         </w:tc>
         <w:tc>
           <w:tcPr>
-            <w:tcW w:w="5500" w:type="dxa"/>
-            <w:tcBorders>
-              <w:top w:val="single" w:sz="4" w:color="CCCCCC"/>
-              <w:left w:val="single" w:sz="4" w:color="CCCCCC"/>
-              <w:bottom w:val="single" w:sz="4" w:color="CCCCCC"/>
-              <w:right w:val="single" w:sz="4" w:color="CCCCCC"/>
-            </w:tcBorders>
-            <w:vAlign w:val="center"/>
-          </w:tcPr>
-          <w:p>
-            <w:pPr>
-              <w:spacing w:before="0" w:after="0" w:line="240" w:lineRule="auto"/>
+            <w:tcW w:w="6400" w:type="dxa"/>
+            <w:tcBorders>
+              <w:top w:val="single" w:sz="4" w:color="CCCCCC"/>
+              <w:left w:val="single" w:sz="4" w:color="CCCCCC"/>
+              <w:bottom w:val="single" w:sz="4" w:color="CCCCCC"/>
+              <w:right w:val="single" w:sz="4" w:color="CCCCCC"/>
+            </w:tcBorders>
+            <w:vAlign w:val="center"/>
+          </w:tcPr>
+          <w:p>
+            <w:pPr>
+              <w:spacing w:before="0" w:after="0" w:line="220" w:lineRule="auto"/>
             </w:pPr>
             <w:r>
               <w:rPr>
@@ -430,7 +426,7 @@
     </w:tbl>
     <w:p>
       <w:pPr>
-        <w:spacing w:before="180" w:after="40" w:line="240" w:lineRule="auto"/>
+        <w:spacing w:before="260" w:after="90" w:line="240" w:lineRule="auto"/>
         <w:pBdr>
           <w:bottom w:val="single" w:sz="12" w:space="2" w:color="1E7A8A"/>
         </w:pBdr>
@@ -449,7 +445,7 @@
     </w:p>
     <w:tbl>
       <w:tblPr>
-        <w:tblW w:w="8500" w:type="dxa"/>
+        <w:tblW w:w="8800" w:type="dxa"/>
         <w:jc w:val="center"/>
         <w:tblBorders>
           <w:top w:val="single" w:sz="4" w:color="CCCCCC"/>
@@ -460,16 +456,16 @@
           <w:insideV w:val="single" w:sz="4" w:color="CCCCCC"/>
         </w:tblBorders>
         <w:tblCellMar>
-          <w:top w:w="60" w:type="dxa"/>
-          <w:left w:w="90" w:type="dxa"/>
-          <w:bottom w:w="60" w:type="dxa"/>
-          <w:right w:w="90" w:type="dxa"/>
+          <w:top w:w="120" w:type="dxa"/>
+          <w:left w:w="80" w:type="dxa"/>
+          <w:bottom w:w="120" w:type="dxa"/>
+          <w:right w:w="80" w:type="dxa"/>
         </w:tblCellMar>
       </w:tblPr>
       <w:tblGrid>
-        <w:gridCol w:w="2833"/>
-        <w:gridCol w:w="2833"/>
-        <w:gridCol w:w="2834"/>
+        <w:gridCol w:w="2933"/>
+        <w:gridCol w:w="2933"/>
+        <w:gridCol w:w="2934"/>
       </w:tblGrid>
       <w:tr>
         <w:trPr>
@@ -477,7 +473,7 @@
         </w:trPr>
         <w:tc>
           <w:tcPr>
-            <w:tcW w:w="2833" w:type="dxa"/>
+            <w:tcW w:w="2933" w:type="dxa"/>
             <w:shd w:val="clear" w:color="auto" w:fill="F5C9C2"/>
             <w:tcBorders>
               <w:top w:val="single" w:sz="4" w:color="CCCCCC"/>
@@ -489,7 +485,7 @@
           </w:tcPr>
           <w:p>
             <w:pPr>
-              <w:spacing w:before="0" w:after="0" w:line="240" w:lineRule="auto"/>
+              <w:spacing w:before="0" w:after="0" w:line="220" w:lineRule="auto"/>
               <w:jc w:val="center"/>
             </w:pPr>
             <w:r>
@@ -506,7 +502,7 @@
         </w:tc>
         <w:tc>
           <w:tcPr>
-            <w:tcW w:w="2833" w:type="dxa"/>
+            <w:tcW w:w="2933" w:type="dxa"/>
             <w:shd w:val="clear" w:color="auto" w:fill="F5C9C2"/>
             <w:tcBorders>
               <w:top w:val="single" w:sz="4" w:color="CCCCCC"/>
@@ -518,7 +514,7 @@
           </w:tcPr>
           <w:p>
             <w:pPr>
-              <w:spacing w:before="0" w:after="0" w:line="240" w:lineRule="auto"/>
+              <w:spacing w:before="0" w:after="0" w:line="220" w:lineRule="auto"/>
               <w:jc w:val="center"/>
             </w:pPr>
             <w:r>
@@ -535,7 +531,7 @@
         </w:tc>
         <w:tc>
           <w:tcPr>
-            <w:tcW w:w="2834" w:type="dxa"/>
+            <w:tcW w:w="2934" w:type="dxa"/>
             <w:shd w:val="clear" w:color="auto" w:fill="F5C9C2"/>
             <w:tcBorders>
               <w:top w:val="single" w:sz="4" w:color="CCCCCC"/>
@@ -547,7 +543,7 @@
           </w:tcPr>
           <w:p>
             <w:pPr>
-              <w:spacing w:before="0" w:after="0" w:line="240" w:lineRule="auto"/>
+              <w:spacing w:before="0" w:after="0" w:line="220" w:lineRule="auto"/>
               <w:jc w:val="center"/>
             </w:pPr>
             <w:r>
@@ -569,25 +565,25 @@
         </w:trPr>
         <w:tc>
           <w:tcPr>
-            <w:tcW w:w="2833" w:type="dxa"/>
-            <w:tcBorders>
-              <w:top w:val="single" w:sz="4" w:color="CCCCCC"/>
-              <w:left w:val="single" w:sz="4" w:color="CCCCCC"/>
-              <w:bottom w:val="single" w:sz="4" w:color="CCCCCC"/>
-              <w:right w:val="single" w:sz="4" w:color="CCCCCC"/>
-            </w:tcBorders>
-            <w:vAlign w:val="center"/>
-          </w:tcPr>
-          <w:p>
-            <w:pPr>
-              <w:spacing w:before="0" w:after="0" w:line="240" w:lineRule="auto"/>
+            <w:tcW w:w="2933" w:type="dxa"/>
+            <w:tcBorders>
+              <w:top w:val="single" w:sz="4" w:color="CCCCCC"/>
+              <w:left w:val="single" w:sz="4" w:color="CCCCCC"/>
+              <w:bottom w:val="single" w:sz="4" w:color="CCCCCC"/>
+              <w:right w:val="single" w:sz="4" w:color="CCCCCC"/>
+            </w:tcBorders>
+            <w:vAlign w:val="center"/>
+          </w:tcPr>
+          <w:p>
+            <w:pPr>
+              <w:spacing w:before="0" w:after="0" w:line="220" w:lineRule="auto"/>
               <w:jc w:val="center"/>
             </w:pPr>
             <w:r>
               <w:rPr>
                 <w:rFonts w:ascii="Arial" w:hAnsi="Arial" w:cs="Arial"/>
-                <w:sz w:val="22"/>
-                <w:szCs w:val="22"/>
+                <w:sz w:val="20"/>
+                <w:szCs w:val="20"/>
                 <w:color w:val="333333"/>
               </w:rPr>
               <w:t xml:space="preserve">{lecturaAnterior}</w:t>
@@ -596,25 +592,25 @@
         </w:tc>
         <w:tc>
           <w:tcPr>
-            <w:tcW w:w="2833" w:type="dxa"/>
-            <w:tcBorders>
-              <w:top w:val="single" w:sz="4" w:color="CCCCCC"/>
-              <w:left w:val="single" w:sz="4" w:color="CCCCCC"/>
-              <w:bottom w:val="single" w:sz="4" w:color="CCCCCC"/>
-              <w:right w:val="single" w:sz="4" w:color="CCCCCC"/>
-            </w:tcBorders>
-            <w:vAlign w:val="center"/>
-          </w:tcPr>
-          <w:p>
-            <w:pPr>
-              <w:spacing w:before="0" w:after="0" w:line="240" w:lineRule="auto"/>
+            <w:tcW w:w="2933" w:type="dxa"/>
+            <w:tcBorders>
+              <w:top w:val="single" w:sz="4" w:color="CCCCCC"/>
+              <w:left w:val="single" w:sz="4" w:color="CCCCCC"/>
+              <w:bottom w:val="single" w:sz="4" w:color="CCCCCC"/>
+              <w:right w:val="single" w:sz="4" w:color="CCCCCC"/>
+            </w:tcBorders>
+            <w:vAlign w:val="center"/>
+          </w:tcPr>
+          <w:p>
+            <w:pPr>
+              <w:spacing w:before="0" w:after="0" w:line="220" w:lineRule="auto"/>
               <w:jc w:val="center"/>
             </w:pPr>
             <w:r>
               <w:rPr>
                 <w:rFonts w:ascii="Arial" w:hAnsi="Arial" w:cs="Arial"/>
-                <w:sz w:val="22"/>
-                <w:szCs w:val="22"/>
+                <w:sz w:val="20"/>
+                <w:szCs w:val="20"/>
                 <w:color w:val="333333"/>
               </w:rPr>
               <w:t xml:space="preserve">{lecturaActual}</w:t>
@@ -623,26 +619,26 @@
         </w:tc>
         <w:tc>
           <w:tcPr>
-            <w:tcW w:w="2834" w:type="dxa"/>
-            <w:tcBorders>
-              <w:top w:val="single" w:sz="4" w:color="CCCCCC"/>
-              <w:left w:val="single" w:sz="4" w:color="CCCCCC"/>
-              <w:bottom w:val="single" w:sz="4" w:color="CCCCCC"/>
-              <w:right w:val="single" w:sz="4" w:color="CCCCCC"/>
-            </w:tcBorders>
-            <w:vAlign w:val="center"/>
-          </w:tcPr>
-          <w:p>
-            <w:pPr>
-              <w:spacing w:before="0" w:after="0" w:line="240" w:lineRule="auto"/>
+            <w:tcW w:w="2934" w:type="dxa"/>
+            <w:tcBorders>
+              <w:top w:val="single" w:sz="4" w:color="CCCCCC"/>
+              <w:left w:val="single" w:sz="4" w:color="CCCCCC"/>
+              <w:bottom w:val="single" w:sz="4" w:color="CCCCCC"/>
+              <w:right w:val="single" w:sz="4" w:color="CCCCCC"/>
+            </w:tcBorders>
+            <w:vAlign w:val="center"/>
+          </w:tcPr>
+          <w:p>
+            <w:pPr>
+              <w:spacing w:before="0" w:after="0" w:line="220" w:lineRule="auto"/>
               <w:jc w:val="center"/>
             </w:pPr>
             <w:r>
               <w:rPr>
                 <w:rFonts w:ascii="Arial" w:hAnsi="Arial" w:cs="Arial"/>
                 <w:b/>
-                <w:sz w:val="22"/>
-                <w:szCs w:val="22"/>
+                <w:sz w:val="20"/>
+                <w:szCs w:val="20"/>
                 <w:color w:val="333333"/>
               </w:rPr>
               <w:t xml:space="preserve">{consumo}</w:t>
@@ -653,7 +649,7 @@
     </w:tbl>
     <w:p>
       <w:pPr>
-        <w:spacing w:before="180" w:after="40" w:line="240" w:lineRule="auto"/>
+        <w:spacing w:before="260" w:after="90" w:line="240" w:lineRule="auto"/>
         <w:pBdr>
           <w:bottom w:val="single" w:sz="12" w:space="2" w:color="1E7A8A"/>
         </w:pBdr>
@@ -672,7 +668,7 @@
     </w:p>
     <w:tbl>
       <w:tblPr>
-        <w:tblW w:w="8500" w:type="dxa"/>
+        <w:tblW w:w="8800" w:type="dxa"/>
         <w:jc w:val="center"/>
         <w:tblBorders>
           <w:top w:val="single" w:sz="4" w:color="CCCCCC"/>
@@ -683,16 +679,16 @@
           <w:insideV w:val="single" w:sz="4" w:color="CCCCCC"/>
         </w:tblBorders>
         <w:tblCellMar>
-          <w:top w:w="60" w:type="dxa"/>
-          <w:left w:w="90" w:type="dxa"/>
-          <w:bottom w:w="60" w:type="dxa"/>
-          <w:right w:w="90" w:type="dxa"/>
+          <w:top w:w="120" w:type="dxa"/>
+          <w:left w:w="80" w:type="dxa"/>
+          <w:bottom w:w="120" w:type="dxa"/>
+          <w:right w:w="80" w:type="dxa"/>
         </w:tblCellMar>
       </w:tblPr>
       <w:tblGrid>
-        <w:gridCol w:w="4675"/>
-        <w:gridCol w:w="1700"/>
-        <w:gridCol w:w="2125"/>
+        <w:gridCol w:w="4840"/>
+        <w:gridCol w:w="1760"/>
+        <w:gridCol w:w="2200"/>
       </w:tblGrid>
       <w:tr>
         <w:trPr>
@@ -700,7 +696,7 @@
         </w:trPr>
         <w:tc>
           <w:tcPr>
-            <w:tcW w:w="4675" w:type="dxa"/>
+            <w:tcW w:w="4840" w:type="dxa"/>
             <w:shd w:val="clear" w:color="auto" w:fill="F5C9C2"/>
             <w:tcBorders>
               <w:top w:val="single" w:sz="4" w:color="CCCCCC"/>
@@ -712,7 +708,7 @@
           </w:tcPr>
           <w:p>
             <w:pPr>
-              <w:spacing w:before="0" w:after="0" w:line="240" w:lineRule="auto"/>
+              <w:spacing w:before="0" w:after="0" w:line="220" w:lineRule="auto"/>
             </w:pPr>
             <w:r>
               <w:rPr>
@@ -728,7 +724,7 @@
         </w:tc>
         <w:tc>
           <w:tcPr>
-            <w:tcW w:w="1700" w:type="dxa"/>
+            <w:tcW w:w="1760" w:type="dxa"/>
             <w:shd w:val="clear" w:color="auto" w:fill="F5C9C2"/>
             <w:tcBorders>
               <w:top w:val="single" w:sz="4" w:color="CCCCCC"/>
@@ -740,7 +736,7 @@
           </w:tcPr>
           <w:p>
             <w:pPr>
-              <w:spacing w:before="0" w:after="0" w:line="240" w:lineRule="auto"/>
+              <w:spacing w:before="0" w:after="0" w:line="220" w:lineRule="auto"/>
               <w:jc w:val="center"/>
             </w:pPr>
             <w:r>
@@ -757,7 +753,7 @@
         </w:tc>
         <w:tc>
           <w:tcPr>
-            <w:tcW w:w="2125" w:type="dxa"/>
+            <w:tcW w:w="2200" w:type="dxa"/>
             <w:shd w:val="clear" w:color="auto" w:fill="F5C9C2"/>
             <w:tcBorders>
               <w:top w:val="single" w:sz="4" w:color="CCCCCC"/>
@@ -769,7 +765,7 @@
           </w:tcPr>
           <w:p>
             <w:pPr>
-              <w:spacing w:before="0" w:after="0" w:line="240" w:lineRule="auto"/>
+              <w:spacing w:before="0" w:after="0" w:line="220" w:lineRule="auto"/>
               <w:jc w:val="center"/>
             </w:pPr>
             <w:r>
@@ -791,18 +787,18 @@
         </w:trPr>
         <w:tc>
           <w:tcPr>
-            <w:tcW w:w="4675" w:type="dxa"/>
-            <w:tcBorders>
-              <w:top w:val="single" w:sz="4" w:color="CCCCCC"/>
-              <w:left w:val="single" w:sz="4" w:color="CCCCCC"/>
-              <w:bottom w:val="single" w:sz="4" w:color="CCCCCC"/>
-              <w:right w:val="single" w:sz="4" w:color="CCCCCC"/>
-            </w:tcBorders>
-            <w:vAlign w:val="center"/>
-          </w:tcPr>
-          <w:p>
-            <w:pPr>
-              <w:spacing w:before="0" w:after="0" w:line="240" w:lineRule="auto"/>
+            <w:tcW w:w="4840" w:type="dxa"/>
+            <w:tcBorders>
+              <w:top w:val="single" w:sz="4" w:color="CCCCCC"/>
+              <w:left w:val="single" w:sz="4" w:color="CCCCCC"/>
+              <w:bottom w:val="single" w:sz="4" w:color="CCCCCC"/>
+              <w:right w:val="single" w:sz="4" w:color="CCCCCC"/>
+            </w:tcBorders>
+            <w:vAlign w:val="center"/>
+          </w:tcPr>
+          <w:p>
+            <w:pPr>
+              <w:spacing w:before="0" w:after="0" w:line="220" w:lineRule="auto"/>
             </w:pPr>
             <w:r>
               <w:rPr>
@@ -817,18 +813,18 @@
         </w:tc>
         <w:tc>
           <w:tcPr>
-            <w:tcW w:w="1700" w:type="dxa"/>
-            <w:tcBorders>
-              <w:top w:val="single" w:sz="4" w:color="CCCCCC"/>
-              <w:left w:val="single" w:sz="4" w:color="CCCCCC"/>
-              <w:bottom w:val="single" w:sz="4" w:color="CCCCCC"/>
-              <w:right w:val="single" w:sz="4" w:color="CCCCCC"/>
-            </w:tcBorders>
-            <w:vAlign w:val="center"/>
-          </w:tcPr>
-          <w:p>
-            <w:pPr>
-              <w:spacing w:before="0" w:after="0" w:line="240" w:lineRule="auto"/>
+            <w:tcW w:w="1760" w:type="dxa"/>
+            <w:tcBorders>
+              <w:top w:val="single" w:sz="4" w:color="CCCCCC"/>
+              <w:left w:val="single" w:sz="4" w:color="CCCCCC"/>
+              <w:bottom w:val="single" w:sz="4" w:color="CCCCCC"/>
+              <w:right w:val="single" w:sz="4" w:color="CCCCCC"/>
+            </w:tcBorders>
+            <w:vAlign w:val="center"/>
+          </w:tcPr>
+          <w:p>
+            <w:pPr>
+              <w:spacing w:before="0" w:after="0" w:line="220" w:lineRule="auto"/>
               <w:jc w:val="center"/>
             </w:pPr>
             <w:r>
@@ -844,18 +840,18 @@
         </w:tc>
         <w:tc>
           <w:tcPr>
-            <w:tcW w:w="2125" w:type="dxa"/>
-            <w:tcBorders>
-              <w:top w:val="single" w:sz="4" w:color="CCCCCC"/>
-              <w:left w:val="single" w:sz="4" w:color="CCCCCC"/>
-              <w:bottom w:val="single" w:sz="4" w:color="CCCCCC"/>
-              <w:right w:val="single" w:sz="4" w:color="CCCCCC"/>
-            </w:tcBorders>
-            <w:vAlign w:val="center"/>
-          </w:tcPr>
-          <w:p>
-            <w:pPr>
-              <w:spacing w:before="0" w:after="0" w:line="240" w:lineRule="auto"/>
+            <w:tcW w:w="2200" w:type="dxa"/>
+            <w:tcBorders>
+              <w:top w:val="single" w:sz="4" w:color="CCCCCC"/>
+              <w:left w:val="single" w:sz="4" w:color="CCCCCC"/>
+              <w:bottom w:val="single" w:sz="4" w:color="CCCCCC"/>
+              <w:right w:val="single" w:sz="4" w:color="CCCCCC"/>
+            </w:tcBorders>
+            <w:vAlign w:val="center"/>
+          </w:tcPr>
+          <w:p>
+            <w:pPr>
+              <w:spacing w:before="0" w:after="0" w:line="220" w:lineRule="auto"/>
               <w:jc w:val="right"/>
             </w:pPr>
             <w:r>
@@ -876,18 +872,18 @@
         </w:trPr>
         <w:tc>
           <w:tcPr>
-            <w:tcW w:w="4675" w:type="dxa"/>
-            <w:tcBorders>
-              <w:top w:val="single" w:sz="4" w:color="CCCCCC"/>
-              <w:left w:val="single" w:sz="4" w:color="CCCCCC"/>
-              <w:bottom w:val="single" w:sz="4" w:color="CCCCCC"/>
-              <w:right w:val="single" w:sz="4" w:color="CCCCCC"/>
-            </w:tcBorders>
-            <w:vAlign w:val="center"/>
-          </w:tcPr>
-          <w:p>
-            <w:pPr>
-              <w:spacing w:before="0" w:after="0" w:line="240" w:lineRule="auto"/>
+            <w:tcW w:w="4840" w:type="dxa"/>
+            <w:tcBorders>
+              <w:top w:val="single" w:sz="4" w:color="CCCCCC"/>
+              <w:left w:val="single" w:sz="4" w:color="CCCCCC"/>
+              <w:bottom w:val="single" w:sz="4" w:color="CCCCCC"/>
+              <w:right w:val="single" w:sz="4" w:color="CCCCCC"/>
+            </w:tcBorders>
+            <w:vAlign w:val="center"/>
+          </w:tcPr>
+          <w:p>
+            <w:pPr>
+              <w:spacing w:before="0" w:after="0" w:line="220" w:lineRule="auto"/>
             </w:pPr>
             <w:r>
               <w:rPr>
@@ -902,18 +898,18 @@
         </w:tc>
         <w:tc>
           <w:tcPr>
-            <w:tcW w:w="1700" w:type="dxa"/>
-            <w:tcBorders>
-              <w:top w:val="single" w:sz="4" w:color="CCCCCC"/>
-              <w:left w:val="single" w:sz="4" w:color="CCCCCC"/>
-              <w:bottom w:val="single" w:sz="4" w:color="CCCCCC"/>
-              <w:right w:val="single" w:sz="4" w:color="CCCCCC"/>
-            </w:tcBorders>
-            <w:vAlign w:val="center"/>
-          </w:tcPr>
-          <w:p>
-            <w:pPr>
-              <w:spacing w:before="0" w:after="0" w:line="240" w:lineRule="auto"/>
+            <w:tcW w:w="1760" w:type="dxa"/>
+            <w:tcBorders>
+              <w:top w:val="single" w:sz="4" w:color="CCCCCC"/>
+              <w:left w:val="single" w:sz="4" w:color="CCCCCC"/>
+              <w:bottom w:val="single" w:sz="4" w:color="CCCCCC"/>
+              <w:right w:val="single" w:sz="4" w:color="CCCCCC"/>
+            </w:tcBorders>
+            <w:vAlign w:val="center"/>
+          </w:tcPr>
+          <w:p>
+            <w:pPr>
+              <w:spacing w:before="0" w:after="0" w:line="220" w:lineRule="auto"/>
               <w:jc w:val="center"/>
             </w:pPr>
             <w:r>
@@ -929,18 +925,18 @@
         </w:tc>
         <w:tc>
           <w:tcPr>
-            <w:tcW w:w="2125" w:type="dxa"/>
-            <w:tcBorders>
-              <w:top w:val="single" w:sz="4" w:color="CCCCCC"/>
-              <w:left w:val="single" w:sz="4" w:color="CCCCCC"/>
-              <w:bottom w:val="single" w:sz="4" w:color="CCCCCC"/>
-              <w:right w:val="single" w:sz="4" w:color="CCCCCC"/>
-            </w:tcBorders>
-            <w:vAlign w:val="center"/>
-          </w:tcPr>
-          <w:p>
-            <w:pPr>
-              <w:spacing w:before="0" w:after="0" w:line="240" w:lineRule="auto"/>
+            <w:tcW w:w="2200" w:type="dxa"/>
+            <w:tcBorders>
+              <w:top w:val="single" w:sz="4" w:color="CCCCCC"/>
+              <w:left w:val="single" w:sz="4" w:color="CCCCCC"/>
+              <w:bottom w:val="single" w:sz="4" w:color="CCCCCC"/>
+              <w:right w:val="single" w:sz="4" w:color="CCCCCC"/>
+            </w:tcBorders>
+            <w:vAlign w:val="center"/>
+          </w:tcPr>
+          <w:p>
+            <w:pPr>
+              <w:spacing w:before="0" w:after="0" w:line="220" w:lineRule="auto"/>
               <w:jc w:val="right"/>
             </w:pPr>
             <w:r>
@@ -961,18 +957,18 @@
         </w:trPr>
         <w:tc>
           <w:tcPr>
-            <w:tcW w:w="4675" w:type="dxa"/>
-            <w:tcBorders>
-              <w:top w:val="single" w:sz="4" w:color="CCCCCC"/>
-              <w:left w:val="single" w:sz="4" w:color="CCCCCC"/>
-              <w:bottom w:val="single" w:sz="4" w:color="CCCCCC"/>
-              <w:right w:val="single" w:sz="4" w:color="CCCCCC"/>
-            </w:tcBorders>
-            <w:vAlign w:val="center"/>
-          </w:tcPr>
-          <w:p>
-            <w:pPr>
-              <w:spacing w:before="0" w:after="0" w:line="240" w:lineRule="auto"/>
+            <w:tcW w:w="4840" w:type="dxa"/>
+            <w:tcBorders>
+              <w:top w:val="single" w:sz="4" w:color="CCCCCC"/>
+              <w:left w:val="single" w:sz="4" w:color="CCCCCC"/>
+              <w:bottom w:val="single" w:sz="4" w:color="CCCCCC"/>
+              <w:right w:val="single" w:sz="4" w:color="CCCCCC"/>
+            </w:tcBorders>
+            <w:vAlign w:val="center"/>
+          </w:tcPr>
+          <w:p>
+            <w:pPr>
+              <w:spacing w:before="0" w:after="0" w:line="220" w:lineRule="auto"/>
             </w:pPr>
             <w:r>
               <w:rPr>
@@ -987,18 +983,18 @@
         </w:tc>
         <w:tc>
           <w:tcPr>
-            <w:tcW w:w="1700" w:type="dxa"/>
-            <w:tcBorders>
-              <w:top w:val="single" w:sz="4" w:color="CCCCCC"/>
-              <w:left w:val="single" w:sz="4" w:color="CCCCCC"/>
-              <w:bottom w:val="single" w:sz="4" w:color="CCCCCC"/>
-              <w:right w:val="single" w:sz="4" w:color="CCCCCC"/>
-            </w:tcBorders>
-            <w:vAlign w:val="center"/>
-          </w:tcPr>
-          <w:p>
-            <w:pPr>
-              <w:spacing w:before="0" w:after="0" w:line="240" w:lineRule="auto"/>
+            <w:tcW w:w="1760" w:type="dxa"/>
+            <w:tcBorders>
+              <w:top w:val="single" w:sz="4" w:color="CCCCCC"/>
+              <w:left w:val="single" w:sz="4" w:color="CCCCCC"/>
+              <w:bottom w:val="single" w:sz="4" w:color="CCCCCC"/>
+              <w:right w:val="single" w:sz="4" w:color="CCCCCC"/>
+            </w:tcBorders>
+            <w:vAlign w:val="center"/>
+          </w:tcPr>
+          <w:p>
+            <w:pPr>
+              <w:spacing w:before="0" w:after="0" w:line="220" w:lineRule="auto"/>
               <w:jc w:val="center"/>
             </w:pPr>
             <w:r>
@@ -1014,18 +1010,18 @@
         </w:tc>
         <w:tc>
           <w:tcPr>
-            <w:tcW w:w="2125" w:type="dxa"/>
-            <w:tcBorders>
-              <w:top w:val="single" w:sz="4" w:color="CCCCCC"/>
-              <w:left w:val="single" w:sz="4" w:color="CCCCCC"/>
-              <w:bottom w:val="single" w:sz="4" w:color="CCCCCC"/>
-              <w:right w:val="single" w:sz="4" w:color="CCCCCC"/>
-            </w:tcBorders>
-            <w:vAlign w:val="center"/>
-          </w:tcPr>
-          <w:p>
-            <w:pPr>
-              <w:spacing w:before="0" w:after="0" w:line="240" w:lineRule="auto"/>
+            <w:tcW w:w="2200" w:type="dxa"/>
+            <w:tcBorders>
+              <w:top w:val="single" w:sz="4" w:color="CCCCCC"/>
+              <w:left w:val="single" w:sz="4" w:color="CCCCCC"/>
+              <w:bottom w:val="single" w:sz="4" w:color="CCCCCC"/>
+              <w:right w:val="single" w:sz="4" w:color="CCCCCC"/>
+            </w:tcBorders>
+            <w:vAlign w:val="center"/>
+          </w:tcPr>
+          <w:p>
+            <w:pPr>
+              <w:spacing w:before="0" w:after="0" w:line="220" w:lineRule="auto"/>
               <w:jc w:val="right"/>
             </w:pPr>
             <w:r>
@@ -1046,7 +1042,7 @@
         </w:trPr>
         <w:tc>
           <w:tcPr>
-            <w:tcW w:w="4675" w:type="dxa"/>
+            <w:tcW w:w="4840" w:type="dxa"/>
             <w:shd w:val="clear" w:color="auto" w:fill="155F6E"/>
             <w:hMerge w:val="restart"/>
             <w:tcBorders>
@@ -1059,55 +1055,7 @@
           </w:tcPr>
           <w:p>
             <w:pPr>
-              <w:spacing w:before="0" w:after="0" w:line="240" w:lineRule="auto"/>
-            </w:pPr>
-            <w:r>
-              <w:rPr>
-                <w:rFonts w:ascii="Arial" w:hAnsi="Arial" w:cs="Arial"/>
-                <w:b/>
-                <w:sz w:val="24"/>
-                <w:szCs w:val="24"/>
-                <w:color w:val="FFFFFF"/>
-              </w:rPr>
-              <w:t xml:space="preserve">TOTAL A PAGAR</w:t>
-            </w:r>
-          </w:p>
-        </w:tc>
-        <w:tc>
-          <w:tcPr>
-            <w:tcW w:w="1700" w:type="dxa"/>
-            <w:shd w:val="clear" w:color="auto" w:fill="155F6E"/>
-            <w:hMerge/>
-            <w:tcBorders>
-              <w:top w:val="single" w:sz="4" w:color="CCCCCC"/>
-              <w:left w:val="single" w:sz="4" w:color="CCCCCC"/>
-              <w:bottom w:val="single" w:sz="4" w:color="CCCCCC"/>
-              <w:right w:val="single" w:sz="4" w:color="CCCCCC"/>
-            </w:tcBorders>
-            <w:vAlign w:val="center"/>
-          </w:tcPr>
-          <w:p>
-            <w:pPr>
-              <w:spacing w:before="0" w:after="0" w:line="240" w:lineRule="auto"/>
-            </w:pPr>
-          </w:p>
-        </w:tc>
-        <w:tc>
-          <w:tcPr>
-            <w:tcW w:w="2125" w:type="dxa"/>
-            <w:shd w:val="clear" w:color="auto" w:fill="155F6E"/>
-            <w:tcBorders>
-              <w:top w:val="single" w:sz="4" w:color="CCCCCC"/>
-              <w:left w:val="single" w:sz="4" w:color="CCCCCC"/>
-              <w:bottom w:val="single" w:sz="4" w:color="CCCCCC"/>
-              <w:right w:val="single" w:sz="4" w:color="CCCCCC"/>
-            </w:tcBorders>
-            <w:vAlign w:val="center"/>
-          </w:tcPr>
-          <w:p>
-            <w:pPr>
-              <w:spacing w:before="0" w:after="0" w:line="240" w:lineRule="auto"/>
-              <w:jc w:val="right"/>
+              <w:spacing w:before="0" w:after="0" w:line="220" w:lineRule="auto"/>
             </w:pPr>
             <w:r>
               <w:rPr>
@@ -1117,6 +1065,54 @@
                 <w:szCs w:val="26"/>
                 <w:color w:val="FFFFFF"/>
               </w:rPr>
+              <w:t xml:space="preserve">TOTAL A PAGAR</w:t>
+            </w:r>
+          </w:p>
+        </w:tc>
+        <w:tc>
+          <w:tcPr>
+            <w:tcW w:w="1760" w:type="dxa"/>
+            <w:shd w:val="clear" w:color="auto" w:fill="155F6E"/>
+            <w:hMerge/>
+            <w:tcBorders>
+              <w:top w:val="single" w:sz="4" w:color="CCCCCC"/>
+              <w:left w:val="single" w:sz="4" w:color="CCCCCC"/>
+              <w:bottom w:val="single" w:sz="4" w:color="CCCCCC"/>
+              <w:right w:val="single" w:sz="4" w:color="CCCCCC"/>
+            </w:tcBorders>
+            <w:vAlign w:val="center"/>
+          </w:tcPr>
+          <w:p>
+            <w:pPr>
+              <w:spacing w:before="0" w:after="0" w:line="220" w:lineRule="auto"/>
+            </w:pPr>
+          </w:p>
+        </w:tc>
+        <w:tc>
+          <w:tcPr>
+            <w:tcW w:w="2200" w:type="dxa"/>
+            <w:shd w:val="clear" w:color="auto" w:fill="155F6E"/>
+            <w:tcBorders>
+              <w:top w:val="single" w:sz="4" w:color="CCCCCC"/>
+              <w:left w:val="single" w:sz="4" w:color="CCCCCC"/>
+              <w:bottom w:val="single" w:sz="4" w:color="CCCCCC"/>
+              <w:right w:val="single" w:sz="4" w:color="CCCCCC"/>
+            </w:tcBorders>
+            <w:vAlign w:val="center"/>
+          </w:tcPr>
+          <w:p>
+            <w:pPr>
+              <w:spacing w:before="0" w:after="0" w:line="220" w:lineRule="auto"/>
+              <w:jc w:val="right"/>
+            </w:pPr>
+            <w:r>
+              <w:rPr>
+                <w:rFonts w:ascii="Arial" w:hAnsi="Arial" w:cs="Arial"/>
+                <w:b/>
+                <w:sz w:val="26"/>
+                <w:szCs w:val="26"/>
+                <w:color w:val="FFFFFF"/>
+              </w:rPr>
               <w:t xml:space="preserve">L  {total}</w:t>
             </w:r>
           </w:p>
@@ -1125,7 +1121,7 @@
     </w:tbl>
     <w:p>
       <w:pPr>
-        <w:spacing w:before="180" w:after="0" w:line="240" w:lineRule="auto"/>
+        <w:spacing w:before="260" w:after="0" w:line="240" w:lineRule="auto"/>
         <w:shd w:val="clear" w:color="auto" w:fill="FFFBEA"/>
         <w:ind w:left="180"/>
         <w:pBdr>
@@ -1136,8 +1132,8 @@
         <w:rPr>
           <w:rFonts w:ascii="Arial" w:hAnsi="Arial" w:cs="Arial"/>
           <w:b/>
-          <w:sz w:val="18"/>
-          <w:szCs w:val="18"/>
+          <w:sz w:val="20"/>
+          <w:szCs w:val="20"/>
           <w:color w:val="333333"/>
         </w:rPr>
         <w:t xml:space="preserve">Método de cálculo: </w:t>
@@ -1145,14 +1141,15 @@
       <w:r>
         <w:rPr>
           <w:rFonts w:ascii="Arial" w:hAnsi="Arial" w:cs="Arial"/>
-          <w:sz w:val="18"/>
-          <w:szCs w:val="18"/>
+          <w:sz w:val="20"/>
+          <w:szCs w:val="20"/>
           <w:color w:val="555555"/>
         </w:rPr>
         <w:t xml:space="preserve">El monto se obtiene prorrateando la factura ENEE de la plaza según el consumo real registrado en el submedidor de cada local. Este recibo no genera ISV.</w:t>
       </w:r>
     </w:p>
     <w:sectPr>
+      <w:footerReference w:type="default" r:id="rId100"/>
       <w:pgSz w:w="12240" w:h="15840" w:code="1"/>
       <w:pgMar w:top="1417" w:right="1701" w:bottom="1417" w:left="1701" w:header="708" w:footer="708" w:gutter="0"/>
       <w:cols w:space="708"/>
@@ -1185,6 +1182,73 @@
     </w:p>
   </w:endnote>
 </w:endnotes>
+</file>
+
+<file path=word/footer1.xml><?xml version="1.0" encoding="utf-8"?>
+<w:ftr xmlns:w="http://schemas.openxmlformats.org/wordprocessingml/2006/main" xmlns:r="http://schemas.openxmlformats.org/officeDocument/2006/relationships">
+  <w:tbl>
+    <w:tblPr>
+      <w:tblW w:w="12240" w:type="dxa"/>
+      <w:tblInd w:w="-1701" w:type="dxa"/>
+      <w:tblBorders>
+        <w:top w:val="nil"/>
+        <w:left w:val="nil"/>
+        <w:bottom w:val="nil"/>
+        <w:right w:val="nil"/>
+        <w:insideH w:val="nil"/>
+        <w:insideV w:val="nil"/>
+      </w:tblBorders>
+      <w:tblCellMar>
+        <w:top w:w="100" w:type="dxa"/>
+        <w:left w:w="200" w:type="dxa"/>
+        <w:bottom w:w="100" w:type="dxa"/>
+        <w:right w:w="200" w:type="dxa"/>
+      </w:tblCellMar>
+    </w:tblPr>
+    <w:tblGrid>
+      <w:gridCol w:w="12240"/>
+    </w:tblGrid>
+    <w:tr>
+      <w:trPr>
+        <w:cantSplit/>
+      </w:trPr>
+      <w:tc>
+        <w:tcPr>
+          <w:tcW w:w="12240" w:type="dxa"/>
+          <w:shd w:val="clear" w:color="auto" w:fill="155F6E"/>
+          <w:tcBorders>
+            <w:top w:val="nil"/>
+            <w:left w:val="nil"/>
+            <w:bottom w:val="nil"/>
+            <w:right w:val="nil"/>
+          </w:tcBorders>
+          <w:vAlign w:val="center"/>
+        </w:tcPr>
+        <w:p>
+          <w:pPr>
+            <w:spacing w:before="0" w:after="0" w:line="240" w:lineRule="auto"/>
+            <w:jc w:val="center"/>
+          </w:pPr>
+          <w:r>
+            <w:rPr>
+              <w:rFonts w:ascii="Arial" w:hAnsi="Arial" w:cs="Arial"/>
+              <w:b/>
+              <w:sz w:val="18"/>
+              <w:szCs w:val="18"/>
+              <w:color w:val="FFFFFF"/>
+            </w:rPr>
+            <w:t xml:space="preserve">☎ +504 9462-8618   |   ✉ soluciones_dyl@yahoo.com   |   ⌂ Res. Altos de Venecia 1   |   RTN: 0801-9022-372253</w:t>
+          </w:r>
+        </w:p>
+      </w:tc>
+    </w:tr>
+  </w:tbl>
+  <w:p>
+    <w:pPr>
+      <w:spacing w:before="0" w:after="0"/>
+    </w:pPr>
+  </w:p>
+</w:ftr>
 </file>
 
 <file path=word/footnotes.xml><?xml version="1.0" encoding="utf-8"?>

</xml_diff>